<commit_message>
Archivos completos de la semana 5
</commit_message>
<xml_diff>
--- a/Week 05/Estudiante_Entrega_GitHub_Semana05.docx
+++ b/Week 05/Estudiante_Entrega_GitHub_Semana05.docx
@@ -477,7 +477,7 @@
         <w:tblLook w:val="04A0" w:firstRow="1" w:lastRow="0" w:firstColumn="1" w:lastColumn="0" w:noHBand="0" w:noVBand="1"/>
       </w:tblPr>
       <w:tblGrid>
-        <w:gridCol w:w="10224"/>
+        <w:gridCol w:w="10440"/>
       </w:tblGrid>
       <w:tr>
         <w:trPr>
@@ -502,6 +502,26 @@
                 <w:szCs w:val="24"/>
               </w:rPr>
             </w:pPr>
+            <w:hyperlink r:id="rId8" w:history="1">
+              <w:r>
+                <w:rPr>
+                  <w:rStyle w:val="Hyperlink"/>
+                  <w:i/>
+                  <w:sz w:val="24"/>
+                  <w:szCs w:val="24"/>
+                </w:rPr>
+                <w:t>https://github.com/</w:t>
+              </w:r>
+              <w:r>
+                <w:rPr>
+                  <w:rStyle w:val="Hyperlink"/>
+                  <w:i/>
+                  <w:sz w:val="24"/>
+                  <w:szCs w:val="24"/>
+                </w:rPr>
+                <w:t>https://raw.githubusercontent.com/Kathe0324/Week-05/refs/heads/main/Nos_Conviene_La_Promocion.py?token=GHSAT0AAAAAAEL336NETMDOOFRKYHY4VWZQ2W6JKLQ</w:t>
+              </w:r>
+            </w:hyperlink>
             <w:r>
               <w:rPr>
                 <w:i/>
@@ -509,7 +529,7 @@
                 <w:sz w:val="24"/>
                 <w:szCs w:val="24"/>
               </w:rPr>
-              <w:t>https://github.com/____________________________________________</w:t>
+              <w:t xml:space="preserve"> </w:t>
             </w:r>
           </w:p>
         </w:tc>
@@ -551,8 +571,8 @@
       </w:r>
     </w:p>
     <w:sectPr>
-      <w:headerReference w:type="default" r:id="rId8"/>
-      <w:footerReference w:type="default" r:id="rId9"/>
+      <w:headerReference w:type="default" r:id="rId9"/>
+      <w:footerReference w:type="default" r:id="rId10"/>
       <w:pgSz w:w="12240" w:h="15840"/>
       <w:pgMar w:top="792" w:right="1008" w:bottom="792" w:left="1008" w:header="720" w:footer="720" w:gutter="0"/>
       <w:cols w:space="720"/>
@@ -12227,6 +12247,29 @@
       </w:tcPr>
     </w:tblStylePr>
   </w:style>
+  <w:style w:type="character" w:styleId="Hyperlink">
+    <w:name w:val="Hyperlink"/>
+    <w:basedOn w:val="DefaultParagraphFont"/>
+    <w:uiPriority w:val="99"/>
+    <w:unhideWhenUsed/>
+    <w:rsid w:val="00243DEB"/>
+    <w:rPr>
+      <w:color w:val="0000FF" w:themeColor="hyperlink"/>
+      <w:u w:val="single"/>
+    </w:rPr>
+  </w:style>
+  <w:style w:type="character" w:styleId="UnresolvedMention">
+    <w:name w:val="Unresolved Mention"/>
+    <w:basedOn w:val="DefaultParagraphFont"/>
+    <w:uiPriority w:val="99"/>
+    <w:semiHidden/>
+    <w:unhideWhenUsed/>
+    <w:rsid w:val="00243DEB"/>
+    <w:rPr>
+      <w:color w:val="605E5C"/>
+      <w:shd w:val="clear" w:color="auto" w:fill="E1DFDD"/>
+    </w:rPr>
+  </w:style>
 </w:styles>
 </file>
 

</xml_diff>